<commit_message>
second final commit: rework lab9
</commit_message>
<xml_diff>
--- a/9/ВвитЛаба№9.docx
+++ b/9/ВвитЛаба№9.docx
@@ -770,11 +770,7 @@
         </w:rPr>
       </w:pPr>
       <w:r>
-        <w:rPr>
-          <w:rFonts w:ascii="Times New Roman" w:hAnsi="Times New Roman"/>
-          <w:sz w:val="28"/>
-          <w:szCs w:val="28"/>
-        </w:rPr>
+        <w:rPr/>
         <w:drawing>
           <wp:inline distT="0" distB="0" distL="0" distR="0">
             <wp:extent cx="3286125" cy="295275"/>
@@ -845,11 +841,7 @@
         </w:rPr>
       </w:pPr>
       <w:r>
-        <w:rPr>
-          <w:rFonts w:ascii="Times New Roman" w:hAnsi="Times New Roman"/>
-          <w:sz w:val="28"/>
-          <w:szCs w:val="28"/>
-        </w:rPr>
+        <w:rPr/>
         <w:drawing>
           <wp:inline distT="0" distB="0" distL="0" distR="0">
             <wp:extent cx="4219575" cy="495300"/>
@@ -962,11 +954,7 @@
         </w:rPr>
       </w:pPr>
       <w:r>
-        <w:rPr>
-          <w:rFonts w:ascii="Times New Roman" w:hAnsi="Times New Roman"/>
-          <w:sz w:val="28"/>
-          <w:szCs w:val="28"/>
-        </w:rPr>
+        <w:rPr/>
         <w:drawing>
           <wp:inline distT="0" distB="0" distL="0" distR="0">
             <wp:extent cx="981075" cy="552450"/>
@@ -1076,11 +1064,7 @@
         </w:rPr>
       </w:pPr>
       <w:r>
-        <w:rPr>
-          <w:rFonts w:ascii="Times New Roman" w:hAnsi="Times New Roman"/>
-          <w:sz w:val="28"/>
-          <w:szCs w:val="28"/>
-        </w:rPr>
+        <w:rPr/>
         <w:drawing>
           <wp:inline distT="0" distB="0" distL="0" distR="0">
             <wp:extent cx="5943600" cy="5295900"/>
@@ -1234,11 +1218,7 @@
         </w:rPr>
       </w:pPr>
       <w:r>
-        <w:rPr>
-          <w:rFonts w:ascii="Times New Roman" w:hAnsi="Times New Roman"/>
-          <w:sz w:val="28"/>
-          <w:szCs w:val="28"/>
-        </w:rPr>
+        <w:rPr/>
         <w:drawing>
           <wp:inline distT="0" distB="0" distL="0" distR="0">
             <wp:extent cx="5943600" cy="390525"/>
@@ -1298,11 +1278,7 @@
         </w:rPr>
       </w:pPr>
       <w:r>
-        <w:rPr>
-          <w:rFonts w:ascii="Times New Roman" w:hAnsi="Times New Roman"/>
-          <w:sz w:val="28"/>
-          <w:szCs w:val="28"/>
-        </w:rPr>
+        <w:rPr/>
         <w:drawing>
           <wp:inline distT="0" distB="0" distL="0" distR="0">
             <wp:extent cx="3286125" cy="1752600"/>
@@ -1420,11 +1396,7 @@
         </w:rPr>
       </w:pPr>
       <w:r>
-        <w:rPr>
-          <w:rFonts w:ascii="Times New Roman" w:hAnsi="Times New Roman"/>
-          <w:sz w:val="28"/>
-          <w:szCs w:val="28"/>
-        </w:rPr>
+        <w:rPr/>
         <w:drawing>
           <wp:inline distT="0" distB="0" distL="0" distR="0">
             <wp:extent cx="2657475" cy="390525"/>
@@ -1496,11 +1468,631 @@
       </w:pPr>
       <w:r>
         <w:rPr>
-          <w:rFonts w:eastAsia="Times New Roman" w:cs="Times New Roman" w:ascii="Times New Roman" w:hAnsi="Times New Roman"/>
-          <w:sz w:val="28"/>
-          <w:szCs w:val="28"/>
-        </w:rPr>
-        <w:t>Заключениe:</w:t>
+          <w:rFonts w:ascii="Times New Roman" w:hAnsi="Times New Roman"/>
+          <w:sz w:val="28"/>
+          <w:szCs w:val="28"/>
+        </w:rPr>
+        <w:t>6. Клонировать удаленный репозиторий</w:t>
+      </w:r>
+    </w:p>
+    <w:p>
+      <w:pPr>
+        <w:pStyle w:val="Normal"/>
+        <w:ind w:hanging="0" w:left="0"/>
+        <w:rPr>
+          <w:rFonts w:ascii="Times New Roman" w:hAnsi="Times New Roman"/>
+          <w:sz w:val="28"/>
+          <w:szCs w:val="28"/>
+        </w:rPr>
+      </w:pPr>
+      <w:r>
+        <w:rPr>
+          <w:rFonts w:ascii="Times New Roman" w:hAnsi="Times New Roman"/>
+          <w:sz w:val="28"/>
+          <w:szCs w:val="28"/>
+        </w:rPr>
+        <w:t>Чтобы клонировать удаленный репозиторий использую команду «git clone», для примера скопирую программу на golang для создания изображения из геометрических фигур (рис 8)</w:t>
+      </w:r>
+    </w:p>
+    <w:p>
+      <w:pPr>
+        <w:pStyle w:val="Normal"/>
+        <w:ind w:hanging="0" w:left="0"/>
+        <w:rPr>
+          <w:rFonts w:ascii="Times New Roman" w:hAnsi="Times New Roman"/>
+          <w:sz w:val="28"/>
+          <w:szCs w:val="28"/>
+        </w:rPr>
+      </w:pPr>
+      <w:r>
+        <w:drawing>
+          <wp:anchor behindDoc="0" distT="0" distB="0" distL="0" distR="0" simplePos="0" locked="0" layoutInCell="0" allowOverlap="1" relativeHeight="9">
+            <wp:simplePos x="0" y="0"/>
+            <wp:positionH relativeFrom="column">
+              <wp:align>center</wp:align>
+            </wp:positionH>
+            <wp:positionV relativeFrom="paragraph">
+              <wp:posOffset>635</wp:posOffset>
+            </wp:positionV>
+            <wp:extent cx="5940425" cy="1126490"/>
+            <wp:effectExtent l="0" t="0" r="0" b="0"/>
+            <wp:wrapSquare wrapText="largest"/>
+            <wp:docPr id="8" name="Изображение1" descr=""/>
+            <wp:cNvGraphicFramePr>
+              <a:graphicFrameLocks xmlns:a="http://schemas.openxmlformats.org/drawingml/2006/main" noChangeAspect="1"/>
+            </wp:cNvGraphicFramePr>
+            <a:graphic xmlns:a="http://schemas.openxmlformats.org/drawingml/2006/main">
+              <a:graphicData uri="http://schemas.openxmlformats.org/drawingml/2006/picture">
+                <pic:pic xmlns:pic="http://schemas.openxmlformats.org/drawingml/2006/picture">
+                  <pic:nvPicPr>
+                    <pic:cNvPr id="8" name="Изображение1" descr=""/>
+                    <pic:cNvPicPr>
+                      <a:picLocks noChangeAspect="1" noChangeArrowheads="1"/>
+                    </pic:cNvPicPr>
+                  </pic:nvPicPr>
+                  <pic:blipFill>
+                    <a:blip r:embed="rId9"/>
+                    <a:stretch>
+                      <a:fillRect/>
+                    </a:stretch>
+                  </pic:blipFill>
+                  <pic:spPr bwMode="auto">
+                    <a:xfrm>
+                      <a:off x="0" y="0"/>
+                      <a:ext cx="5940425" cy="1126490"/>
+                    </a:xfrm>
+                    <a:prstGeom prst="rect">
+                      <a:avLst/>
+                    </a:prstGeom>
+                    <a:noFill/>
+                  </pic:spPr>
+                </pic:pic>
+              </a:graphicData>
+            </a:graphic>
+          </wp:anchor>
+        </w:drawing>
+      </w:r>
+      <w:r>
+        <w:rPr>
+          <w:rFonts w:ascii="Times New Roman" w:hAnsi="Times New Roman"/>
+          <w:sz w:val="28"/>
+          <w:szCs w:val="28"/>
+        </w:rPr>
+        <w:t>Рис 8</w:t>
+      </w:r>
+    </w:p>
+    <w:p>
+      <w:pPr>
+        <w:pStyle w:val="Normal"/>
+        <w:ind w:hanging="0" w:left="0"/>
+        <w:rPr>
+          <w:rFonts w:ascii="Times New Roman" w:hAnsi="Times New Roman"/>
+          <w:sz w:val="28"/>
+          <w:szCs w:val="28"/>
+        </w:rPr>
+      </w:pPr>
+      <w:r>
+        <w:rPr>
+          <w:rFonts w:ascii="Times New Roman" w:hAnsi="Times New Roman"/>
+          <w:sz w:val="28"/>
+          <w:szCs w:val="28"/>
+        </w:rPr>
+        <w:t>7. Добавить удаленный репозиторий</w:t>
+      </w:r>
+    </w:p>
+    <w:p>
+      <w:pPr>
+        <w:pStyle w:val="Normal"/>
+        <w:ind w:hanging="0" w:left="0"/>
+        <w:rPr>
+          <w:rFonts w:ascii="Times New Roman" w:hAnsi="Times New Roman"/>
+          <w:sz w:val="28"/>
+          <w:szCs w:val="28"/>
+        </w:rPr>
+      </w:pPr>
+      <w:r>
+        <w:rPr>
+          <w:rFonts w:ascii="Times New Roman" w:hAnsi="Times New Roman"/>
+          <w:sz w:val="28"/>
+          <w:szCs w:val="28"/>
+        </w:rPr>
+        <w:t>В командной строке выполни</w:t>
+      </w:r>
+      <w:r>
+        <w:rPr>
+          <w:rFonts w:ascii="Times New Roman" w:hAnsi="Times New Roman"/>
+          <w:sz w:val="28"/>
+          <w:szCs w:val="28"/>
+        </w:rPr>
+        <w:t>м</w:t>
+      </w:r>
+      <w:r>
+        <w:rPr>
+          <w:rFonts w:ascii="Times New Roman" w:hAnsi="Times New Roman"/>
+          <w:sz w:val="28"/>
+          <w:szCs w:val="28"/>
+        </w:rPr>
+        <w:t xml:space="preserve"> команду «git remote add origin» </w:t>
+      </w:r>
+      <w:r>
+        <w:rPr>
+          <w:rFonts w:ascii="Times New Roman" w:hAnsi="Times New Roman"/>
+          <w:sz w:val="28"/>
+          <w:szCs w:val="28"/>
+        </w:rPr>
+        <w:t>с ссылкой «</w:t>
+      </w:r>
+      <w:hyperlink r:id="rId10">
+        <w:r>
+          <w:rPr>
+            <w:rStyle w:val="Hyperlink"/>
+            <w:rFonts w:ascii="Times New Roman" w:hAnsi="Times New Roman"/>
+            <w:sz w:val="28"/>
+            <w:szCs w:val="28"/>
+          </w:rPr>
+          <w:t>git@github.com</w:t>
+        </w:r>
+      </w:hyperlink>
+      <w:r>
+        <w:rPr>
+          <w:rFonts w:ascii="Times New Roman" w:hAnsi="Times New Roman"/>
+          <w:sz w:val="28"/>
+          <w:szCs w:val="28"/>
+        </w:rPr>
+        <w:t xml:space="preserve">:Bulbanator123/labsmtucivvit.git»  для добавления удаленного репозитория в локальный. </w:t>
+      </w:r>
+      <w:r>
+        <w:rPr>
+          <w:rFonts w:ascii="Times New Roman" w:hAnsi="Times New Roman"/>
+          <w:sz w:val="28"/>
+          <w:szCs w:val="28"/>
+        </w:rPr>
+        <w:t>Поскольку у меня есть ssh ключ в гитхаб, то буду использовать ssh ссылку из github. (Рис 9)</w:t>
+      </w:r>
+    </w:p>
+    <w:p>
+      <w:pPr>
+        <w:pStyle w:val="Normal"/>
+        <w:ind w:hanging="0" w:left="0"/>
+        <w:rPr>
+          <w:rFonts w:ascii="Times New Roman" w:hAnsi="Times New Roman"/>
+          <w:sz w:val="28"/>
+          <w:szCs w:val="28"/>
+        </w:rPr>
+      </w:pPr>
+      <w:r>
+        <w:drawing>
+          <wp:anchor behindDoc="0" distT="0" distB="0" distL="0" distR="0" simplePos="0" locked="0" layoutInCell="0" allowOverlap="1" relativeHeight="10">
+            <wp:simplePos x="0" y="0"/>
+            <wp:positionH relativeFrom="column">
+              <wp:align>center</wp:align>
+            </wp:positionH>
+            <wp:positionV relativeFrom="paragraph">
+              <wp:posOffset>635</wp:posOffset>
+            </wp:positionV>
+            <wp:extent cx="5940425" cy="260350"/>
+            <wp:effectExtent l="0" t="0" r="0" b="0"/>
+            <wp:wrapSquare wrapText="largest"/>
+            <wp:docPr id="9" name="Изображение8" descr=""/>
+            <wp:cNvGraphicFramePr>
+              <a:graphicFrameLocks xmlns:a="http://schemas.openxmlformats.org/drawingml/2006/main" noChangeAspect="1"/>
+            </wp:cNvGraphicFramePr>
+            <a:graphic xmlns:a="http://schemas.openxmlformats.org/drawingml/2006/main">
+              <a:graphicData uri="http://schemas.openxmlformats.org/drawingml/2006/picture">
+                <pic:pic xmlns:pic="http://schemas.openxmlformats.org/drawingml/2006/picture">
+                  <pic:nvPicPr>
+                    <pic:cNvPr id="9" name="Изображение8" descr=""/>
+                    <pic:cNvPicPr>
+                      <a:picLocks noChangeAspect="1" noChangeArrowheads="1"/>
+                    </pic:cNvPicPr>
+                  </pic:nvPicPr>
+                  <pic:blipFill>
+                    <a:blip r:embed="rId11"/>
+                    <a:stretch>
+                      <a:fillRect/>
+                    </a:stretch>
+                  </pic:blipFill>
+                  <pic:spPr bwMode="auto">
+                    <a:xfrm>
+                      <a:off x="0" y="0"/>
+                      <a:ext cx="5940425" cy="260350"/>
+                    </a:xfrm>
+                    <a:prstGeom prst="rect">
+                      <a:avLst/>
+                    </a:prstGeom>
+                    <a:noFill/>
+                  </pic:spPr>
+                </pic:pic>
+              </a:graphicData>
+            </a:graphic>
+          </wp:anchor>
+        </w:drawing>
+      </w:r>
+      <w:r>
+        <w:rPr>
+          <w:rFonts w:ascii="Times New Roman" w:hAnsi="Times New Roman"/>
+          <w:sz w:val="28"/>
+          <w:szCs w:val="28"/>
+        </w:rPr>
+        <w:t>Рис 9</w:t>
+      </w:r>
+    </w:p>
+    <w:p>
+      <w:pPr>
+        <w:pStyle w:val="Normal"/>
+        <w:ind w:hanging="0" w:left="0"/>
+        <w:rPr>
+          <w:rFonts w:ascii="Times New Roman" w:hAnsi="Times New Roman"/>
+          <w:sz w:val="28"/>
+          <w:szCs w:val="28"/>
+        </w:rPr>
+      </w:pPr>
+      <w:r>
+        <w:rPr>
+          <w:rFonts w:ascii="Times New Roman" w:hAnsi="Times New Roman"/>
+          <w:sz w:val="28"/>
+          <w:szCs w:val="28"/>
+        </w:rPr>
+      </w:r>
+    </w:p>
+    <w:p>
+      <w:pPr>
+        <w:pStyle w:val="Normal"/>
+        <w:ind w:hanging="0" w:left="0"/>
+        <w:rPr>
+          <w:rFonts w:ascii="Times New Roman" w:hAnsi="Times New Roman"/>
+          <w:sz w:val="28"/>
+          <w:szCs w:val="28"/>
+        </w:rPr>
+      </w:pPr>
+      <w:r>
+        <w:rPr>
+          <w:rFonts w:ascii="Times New Roman" w:hAnsi="Times New Roman"/>
+          <w:sz w:val="28"/>
+          <w:szCs w:val="28"/>
+        </w:rPr>
+      </w:r>
+    </w:p>
+    <w:p>
+      <w:pPr>
+        <w:pStyle w:val="Normal"/>
+        <w:ind w:hanging="0" w:left="0"/>
+        <w:rPr>
+          <w:rFonts w:ascii="Times New Roman" w:hAnsi="Times New Roman"/>
+          <w:sz w:val="28"/>
+          <w:szCs w:val="28"/>
+        </w:rPr>
+      </w:pPr>
+      <w:r>
+        <w:rPr>
+          <w:rFonts w:ascii="Times New Roman" w:hAnsi="Times New Roman"/>
+          <w:sz w:val="28"/>
+          <w:szCs w:val="28"/>
+        </w:rPr>
+        <w:t>8. Отправить изменения на удаленный репозиторий</w:t>
+      </w:r>
+    </w:p>
+    <w:p>
+      <w:pPr>
+        <w:pStyle w:val="Normal"/>
+        <w:ind w:hanging="0" w:left="0"/>
+        <w:rPr>
+          <w:rFonts w:ascii="Times New Roman" w:hAnsi="Times New Roman"/>
+          <w:sz w:val="28"/>
+          <w:szCs w:val="28"/>
+        </w:rPr>
+      </w:pPr>
+      <w:r>
+        <w:rPr>
+          <w:rFonts w:ascii="Times New Roman" w:hAnsi="Times New Roman"/>
+          <w:sz w:val="28"/>
+          <w:szCs w:val="28"/>
+        </w:rPr>
+        <w:t>Выполним команду git push для отправки изменений из локального репозитория на удаленный. Проверить, что изменения успешно отправлены на удаленный репозиторий. (Рис 10)</w:t>
+      </w:r>
+    </w:p>
+    <w:p>
+      <w:pPr>
+        <w:pStyle w:val="Normal"/>
+        <w:ind w:hanging="0" w:left="0"/>
+        <w:rPr>
+          <w:rFonts w:ascii="Times New Roman" w:hAnsi="Times New Roman"/>
+          <w:sz w:val="28"/>
+          <w:szCs w:val="28"/>
+        </w:rPr>
+      </w:pPr>
+      <w:r>
+        <w:drawing>
+          <wp:anchor behindDoc="0" distT="0" distB="0" distL="0" distR="0" simplePos="0" locked="0" layoutInCell="0" allowOverlap="1" relativeHeight="11">
+            <wp:simplePos x="0" y="0"/>
+            <wp:positionH relativeFrom="column">
+              <wp:align>center</wp:align>
+            </wp:positionH>
+            <wp:positionV relativeFrom="paragraph">
+              <wp:posOffset>635</wp:posOffset>
+            </wp:positionV>
+            <wp:extent cx="5940425" cy="1839595"/>
+            <wp:effectExtent l="0" t="0" r="0" b="0"/>
+            <wp:wrapSquare wrapText="largest"/>
+            <wp:docPr id="10" name="Изображение9" descr=""/>
+            <wp:cNvGraphicFramePr>
+              <a:graphicFrameLocks xmlns:a="http://schemas.openxmlformats.org/drawingml/2006/main" noChangeAspect="1"/>
+            </wp:cNvGraphicFramePr>
+            <a:graphic xmlns:a="http://schemas.openxmlformats.org/drawingml/2006/main">
+              <a:graphicData uri="http://schemas.openxmlformats.org/drawingml/2006/picture">
+                <pic:pic xmlns:pic="http://schemas.openxmlformats.org/drawingml/2006/picture">
+                  <pic:nvPicPr>
+                    <pic:cNvPr id="10" name="Изображение9" descr=""/>
+                    <pic:cNvPicPr>
+                      <a:picLocks noChangeAspect="1" noChangeArrowheads="1"/>
+                    </pic:cNvPicPr>
+                  </pic:nvPicPr>
+                  <pic:blipFill>
+                    <a:blip r:embed="rId12"/>
+                    <a:stretch>
+                      <a:fillRect/>
+                    </a:stretch>
+                  </pic:blipFill>
+                  <pic:spPr bwMode="auto">
+                    <a:xfrm>
+                      <a:off x="0" y="0"/>
+                      <a:ext cx="5940425" cy="1839595"/>
+                    </a:xfrm>
+                    <a:prstGeom prst="rect">
+                      <a:avLst/>
+                    </a:prstGeom>
+                    <a:noFill/>
+                  </pic:spPr>
+                </pic:pic>
+              </a:graphicData>
+            </a:graphic>
+          </wp:anchor>
+        </w:drawing>
+      </w:r>
+      <w:r>
+        <w:rPr>
+          <w:rFonts w:ascii="Times New Roman" w:hAnsi="Times New Roman"/>
+          <w:sz w:val="28"/>
+          <w:szCs w:val="28"/>
+        </w:rPr>
+        <w:t>Рис 10</w:t>
+      </w:r>
+    </w:p>
+    <w:p>
+      <w:pPr>
+        <w:pStyle w:val="Normal"/>
+        <w:ind w:hanging="0" w:left="0"/>
+        <w:rPr>
+          <w:rFonts w:ascii="Times New Roman" w:hAnsi="Times New Roman"/>
+          <w:sz w:val="28"/>
+          <w:szCs w:val="28"/>
+        </w:rPr>
+      </w:pPr>
+      <w:r>
+        <w:rPr>
+          <w:rFonts w:ascii="Times New Roman" w:hAnsi="Times New Roman"/>
+          <w:sz w:val="28"/>
+          <w:szCs w:val="28"/>
+        </w:rPr>
+        <w:t>9. Работа с ветками на удаленном репозитории</w:t>
+      </w:r>
+    </w:p>
+    <w:p>
+      <w:pPr>
+        <w:pStyle w:val="Normal"/>
+        <w:ind w:hanging="0" w:left="0"/>
+        <w:rPr>
+          <w:rFonts w:ascii="Times New Roman" w:hAnsi="Times New Roman"/>
+          <w:sz w:val="28"/>
+          <w:szCs w:val="28"/>
+        </w:rPr>
+      </w:pPr>
+      <w:r>
+        <w:rPr>
+          <w:rFonts w:ascii="Times New Roman" w:hAnsi="Times New Roman"/>
+          <w:sz w:val="28"/>
+          <w:szCs w:val="28"/>
+        </w:rPr>
+        <w:t xml:space="preserve">Создадим новую ветку локально с помощью команды git checkout -b dev. Запушим новую ветку на удаленный репозиторий с помощью команды git push origin dev. Удалим ветку из удаленного репозитория с помощью команды git push origin --delete </w:t>
+      </w:r>
+      <w:r>
+        <w:rPr>
+          <w:rFonts w:ascii="Times New Roman" w:hAnsi="Times New Roman"/>
+          <w:sz w:val="28"/>
+          <w:szCs w:val="28"/>
+        </w:rPr>
+        <w:t>dev</w:t>
+      </w:r>
+      <w:r>
+        <w:rPr>
+          <w:rFonts w:ascii="Times New Roman" w:hAnsi="Times New Roman"/>
+          <w:sz w:val="28"/>
+          <w:szCs w:val="28"/>
+        </w:rPr>
+        <w:t xml:space="preserve">. </w:t>
+      </w:r>
+      <w:r>
+        <w:rPr>
+          <w:rFonts w:ascii="Times New Roman" w:hAnsi="Times New Roman"/>
+          <w:sz w:val="28"/>
+          <w:szCs w:val="28"/>
+        </w:rPr>
+        <w:t>Смотри рис 11 и 12</w:t>
+      </w:r>
+    </w:p>
+    <w:p>
+      <w:pPr>
+        <w:pStyle w:val="Normal"/>
+        <w:ind w:hanging="0" w:left="0"/>
+        <w:rPr>
+          <w:rFonts w:ascii="Times New Roman" w:hAnsi="Times New Roman"/>
+          <w:sz w:val="28"/>
+          <w:szCs w:val="28"/>
+        </w:rPr>
+      </w:pPr>
+      <w:r>
+        <w:drawing>
+          <wp:anchor behindDoc="0" distT="0" distB="0" distL="0" distR="0" simplePos="0" locked="0" layoutInCell="0" allowOverlap="1" relativeHeight="12">
+            <wp:simplePos x="0" y="0"/>
+            <wp:positionH relativeFrom="column">
+              <wp:align>center</wp:align>
+            </wp:positionH>
+            <wp:positionV relativeFrom="paragraph">
+              <wp:posOffset>635</wp:posOffset>
+            </wp:positionV>
+            <wp:extent cx="5940425" cy="2186305"/>
+            <wp:effectExtent l="0" t="0" r="0" b="0"/>
+            <wp:wrapSquare wrapText="largest"/>
+            <wp:docPr id="11" name="Изображение11" descr=""/>
+            <wp:cNvGraphicFramePr>
+              <a:graphicFrameLocks xmlns:a="http://schemas.openxmlformats.org/drawingml/2006/main" noChangeAspect="1"/>
+            </wp:cNvGraphicFramePr>
+            <a:graphic xmlns:a="http://schemas.openxmlformats.org/drawingml/2006/main">
+              <a:graphicData uri="http://schemas.openxmlformats.org/drawingml/2006/picture">
+                <pic:pic xmlns:pic="http://schemas.openxmlformats.org/drawingml/2006/picture">
+                  <pic:nvPicPr>
+                    <pic:cNvPr id="11" name="Изображение11" descr=""/>
+                    <pic:cNvPicPr>
+                      <a:picLocks noChangeAspect="1" noChangeArrowheads="1"/>
+                    </pic:cNvPicPr>
+                  </pic:nvPicPr>
+                  <pic:blipFill>
+                    <a:blip r:embed="rId13"/>
+                    <a:stretch>
+                      <a:fillRect/>
+                    </a:stretch>
+                  </pic:blipFill>
+                  <pic:spPr bwMode="auto">
+                    <a:xfrm>
+                      <a:off x="0" y="0"/>
+                      <a:ext cx="5940425" cy="2186305"/>
+                    </a:xfrm>
+                    <a:prstGeom prst="rect">
+                      <a:avLst/>
+                    </a:prstGeom>
+                    <a:noFill/>
+                  </pic:spPr>
+                </pic:pic>
+              </a:graphicData>
+            </a:graphic>
+          </wp:anchor>
+        </w:drawing>
+      </w:r>
+      <w:r>
+        <w:rPr>
+          <w:rFonts w:ascii="Times New Roman" w:hAnsi="Times New Roman"/>
+          <w:sz w:val="28"/>
+          <w:szCs w:val="28"/>
+        </w:rPr>
+        <w:t>Рис 11</w:t>
+      </w:r>
+    </w:p>
+    <w:p>
+      <w:pPr>
+        <w:pStyle w:val="Normal"/>
+        <w:ind w:hanging="0" w:left="0"/>
+        <w:rPr>
+          <w:rFonts w:ascii="Times New Roman" w:hAnsi="Times New Roman"/>
+          <w:sz w:val="28"/>
+          <w:szCs w:val="28"/>
+        </w:rPr>
+      </w:pPr>
+      <w:r>
+        <w:rPr>
+          <w:rFonts w:ascii="Times New Roman" w:hAnsi="Times New Roman"/>
+          <w:sz w:val="28"/>
+          <w:szCs w:val="28"/>
+        </w:rPr>
+      </w:r>
+    </w:p>
+    <w:p>
+      <w:pPr>
+        <w:pStyle w:val="Normal"/>
+        <w:ind w:hanging="0" w:left="0"/>
+        <w:rPr>
+          <w:rFonts w:ascii="Times New Roman" w:hAnsi="Times New Roman"/>
+          <w:sz w:val="28"/>
+          <w:szCs w:val="28"/>
+        </w:rPr>
+      </w:pPr>
+      <w:r>
+        <w:rPr>
+          <w:rFonts w:ascii="Times New Roman" w:hAnsi="Times New Roman"/>
+          <w:sz w:val="28"/>
+          <w:szCs w:val="28"/>
+        </w:rPr>
+      </w:r>
+    </w:p>
+    <w:p>
+      <w:pPr>
+        <w:pStyle w:val="Normal"/>
+        <w:ind w:hanging="0" w:left="0"/>
+        <w:rPr>
+          <w:rFonts w:ascii="Times New Roman" w:hAnsi="Times New Roman"/>
+          <w:sz w:val="28"/>
+          <w:szCs w:val="28"/>
+        </w:rPr>
+      </w:pPr>
+      <w:r>
+        <w:rPr>
+          <w:rFonts w:eastAsia="Times New Roman" w:cs="Times New Roman" w:ascii="Times New Roman" w:hAnsi="Times New Roman"/>
+          <w:sz w:val="28"/>
+          <w:szCs w:val="28"/>
+        </w:rPr>
+      </w:r>
+    </w:p>
+    <w:p>
+      <w:pPr>
+        <w:pStyle w:val="Normal"/>
+        <w:ind w:hanging="0" w:left="0"/>
+        <w:rPr>
+          <w:rFonts w:ascii="Times New Roman" w:hAnsi="Times New Roman"/>
+          <w:sz w:val="28"/>
+          <w:szCs w:val="28"/>
+        </w:rPr>
+      </w:pPr>
+      <w:r>
+        <w:rPr>
+          <w:rFonts w:eastAsia="Times New Roman" w:cs="Times New Roman" w:ascii="Times New Roman" w:hAnsi="Times New Roman"/>
+          <w:sz w:val="28"/>
+          <w:szCs w:val="28"/>
+        </w:rPr>
+      </w:r>
+    </w:p>
+    <w:p>
+      <w:pPr>
+        <w:pStyle w:val="Normal"/>
+        <w:ind w:hanging="0" w:left="0"/>
+        <w:rPr>
+          <w:rFonts w:ascii="Times New Roman" w:hAnsi="Times New Roman"/>
+          <w:sz w:val="28"/>
+          <w:szCs w:val="28"/>
+        </w:rPr>
+      </w:pPr>
+      <w:r>
+        <w:rPr>
+          <w:rFonts w:eastAsia="Times New Roman" w:cs="Times New Roman" w:ascii="Times New Roman" w:hAnsi="Times New Roman"/>
+          <w:sz w:val="28"/>
+          <w:szCs w:val="28"/>
+        </w:rPr>
+      </w:r>
+    </w:p>
+    <w:p>
+      <w:pPr>
+        <w:pStyle w:val="Normal"/>
+        <w:ind w:hanging="0" w:left="0"/>
+        <w:rPr>
+          <w:rFonts w:ascii="Times New Roman" w:hAnsi="Times New Roman"/>
+          <w:sz w:val="28"/>
+          <w:szCs w:val="28"/>
+        </w:rPr>
+      </w:pPr>
+      <w:r>
+        <w:rPr>
+          <w:rFonts w:eastAsia="Times New Roman" w:cs="Times New Roman" w:ascii="Times New Roman" w:hAnsi="Times New Roman"/>
+          <w:sz w:val="28"/>
+          <w:szCs w:val="28"/>
+        </w:rPr>
       </w:r>
     </w:p>
     <w:p>
@@ -1516,6 +2108,278 @@
         </w:rPr>
       </w:pPr>
       <w:r>
+        <w:drawing>
+          <wp:anchor behindDoc="0" distT="0" distB="0" distL="0" distR="0" simplePos="0" locked="0" layoutInCell="0" allowOverlap="1" relativeHeight="13">
+            <wp:simplePos x="0" y="0"/>
+            <wp:positionH relativeFrom="column">
+              <wp:posOffset>19050</wp:posOffset>
+            </wp:positionH>
+            <wp:positionV relativeFrom="paragraph">
+              <wp:posOffset>-121920</wp:posOffset>
+            </wp:positionV>
+            <wp:extent cx="4286250" cy="4181475"/>
+            <wp:effectExtent l="0" t="0" r="0" b="0"/>
+            <wp:wrapSquare wrapText="largest"/>
+            <wp:docPr id="12" name="Изображение10" descr=""/>
+            <wp:cNvGraphicFramePr>
+              <a:graphicFrameLocks xmlns:a="http://schemas.openxmlformats.org/drawingml/2006/main" noChangeAspect="1"/>
+            </wp:cNvGraphicFramePr>
+            <a:graphic xmlns:a="http://schemas.openxmlformats.org/drawingml/2006/main">
+              <a:graphicData uri="http://schemas.openxmlformats.org/drawingml/2006/picture">
+                <pic:pic xmlns:pic="http://schemas.openxmlformats.org/drawingml/2006/picture">
+                  <pic:nvPicPr>
+                    <pic:cNvPr id="12" name="Изображение10" descr=""/>
+                    <pic:cNvPicPr>
+                      <a:picLocks noChangeAspect="1" noChangeArrowheads="1"/>
+                    </pic:cNvPicPr>
+                  </pic:nvPicPr>
+                  <pic:blipFill>
+                    <a:blip r:embed="rId14"/>
+                    <a:stretch>
+                      <a:fillRect/>
+                    </a:stretch>
+                  </pic:blipFill>
+                  <pic:spPr bwMode="auto">
+                    <a:xfrm>
+                      <a:off x="0" y="0"/>
+                      <a:ext cx="4286250" cy="4181475"/>
+                    </a:xfrm>
+                    <a:prstGeom prst="rect">
+                      <a:avLst/>
+                    </a:prstGeom>
+                    <a:noFill/>
+                  </pic:spPr>
+                </pic:pic>
+              </a:graphicData>
+            </a:graphic>
+          </wp:anchor>
+        </w:drawing>
+      </w:r>
+      <w:r>
+        <w:rPr>
+          <w:rFonts w:eastAsia="Times New Roman" w:cs="Times New Roman" w:ascii="Times New Roman" w:hAnsi="Times New Roman"/>
+          <w:sz w:val="28"/>
+          <w:szCs w:val="28"/>
+        </w:rPr>
+        <w:br/>
+        <w:br/>
+        <w:br/>
+        <w:br/>
+        <w:br/>
+        <w:br/>
+        <w:br/>
+        <w:br/>
+        <w:br/>
+        <w:br/>
+        <w:br/>
+        <w:br/>
+        <w:br/>
+        <w:br/>
+        <w:br/>
+        <w:br/>
+        <w:br/>
+        <w:br/>
+        <w:br/>
+        <w:br/>
+      </w:r>
+      <w:r>
+        <w:rPr>
+          <w:rFonts w:eastAsia="Times New Roman" w:cs="Times New Roman" w:ascii="Times New Roman" w:hAnsi="Times New Roman"/>
+          <w:sz w:val="28"/>
+          <w:szCs w:val="28"/>
+        </w:rPr>
+        <w:t>Рис 12</w:t>
+      </w:r>
+    </w:p>
+    <w:p>
+      <w:pPr>
+        <w:pStyle w:val="Normal"/>
+        <w:spacing w:lineRule="auto" w:line="259" w:beforeAutospacing="0" w:before="0" w:afterAutospacing="0" w:after="160"/>
+        <w:ind w:left="0" w:right="0"/>
+        <w:jc w:val="left"/>
+        <w:rPr>
+          <w:rFonts w:ascii="Times New Roman" w:hAnsi="Times New Roman"/>
+          <w:sz w:val="28"/>
+          <w:szCs w:val="28"/>
+        </w:rPr>
+      </w:pPr>
+      <w:r>
+        <w:rPr>
+          <w:rFonts w:eastAsia="Times New Roman" w:cs="Times New Roman" w:ascii="Times New Roman" w:hAnsi="Times New Roman"/>
+          <w:sz w:val="28"/>
+          <w:szCs w:val="28"/>
+        </w:rPr>
+        <w:t>10. Получение изменений из удаленного репозитория</w:t>
+      </w:r>
+    </w:p>
+    <w:p>
+      <w:pPr>
+        <w:pStyle w:val="Normal"/>
+        <w:spacing w:lineRule="auto" w:line="259" w:beforeAutospacing="0" w:before="0" w:afterAutospacing="0" w:after="160"/>
+        <w:ind w:left="0" w:right="0"/>
+        <w:jc w:val="left"/>
+        <w:rPr>
+          <w:rFonts w:ascii="Times New Roman" w:hAnsi="Times New Roman"/>
+          <w:sz w:val="28"/>
+          <w:szCs w:val="28"/>
+        </w:rPr>
+      </w:pPr>
+      <w:r>
+        <w:rPr>
+          <w:rFonts w:eastAsia="Times New Roman" w:cs="Times New Roman" w:ascii="Times New Roman" w:hAnsi="Times New Roman"/>
+          <w:sz w:val="28"/>
+          <w:szCs w:val="28"/>
+        </w:rPr>
+        <w:t>Выполни</w:t>
+      </w:r>
+      <w:r>
+        <w:rPr>
+          <w:rFonts w:eastAsia="Times New Roman" w:cs="Times New Roman" w:ascii="Times New Roman" w:hAnsi="Times New Roman"/>
+          <w:sz w:val="28"/>
+          <w:szCs w:val="28"/>
+        </w:rPr>
+        <w:t>м</w:t>
+      </w:r>
+      <w:r>
+        <w:rPr>
+          <w:rFonts w:eastAsia="Times New Roman" w:cs="Times New Roman" w:ascii="Times New Roman" w:hAnsi="Times New Roman"/>
+          <w:sz w:val="28"/>
+          <w:szCs w:val="28"/>
+        </w:rPr>
+        <w:t xml:space="preserve"> команду git pull origin </w:t>
+      </w:r>
+      <w:r>
+        <w:rPr>
+          <w:rFonts w:eastAsia="Times New Roman" w:cs="Times New Roman" w:ascii="Times New Roman" w:hAnsi="Times New Roman"/>
+          <w:sz w:val="28"/>
+          <w:szCs w:val="28"/>
+        </w:rPr>
+        <w:t>master</w:t>
+      </w:r>
+      <w:r>
+        <w:rPr>
+          <w:rFonts w:eastAsia="Times New Roman" w:cs="Times New Roman" w:ascii="Times New Roman" w:hAnsi="Times New Roman"/>
+          <w:sz w:val="28"/>
+          <w:szCs w:val="28"/>
+        </w:rPr>
+        <w:t xml:space="preserve"> для получения изменений из удаленного репозитория на локальный. Убеди</w:t>
+      </w:r>
+      <w:r>
+        <w:rPr>
+          <w:rFonts w:eastAsia="Times New Roman" w:cs="Times New Roman" w:ascii="Times New Roman" w:hAnsi="Times New Roman"/>
+          <w:sz w:val="28"/>
+          <w:szCs w:val="28"/>
+        </w:rPr>
+        <w:t>мся</w:t>
+      </w:r>
+      <w:r>
+        <w:rPr>
+          <w:rFonts w:eastAsia="Times New Roman" w:cs="Times New Roman" w:ascii="Times New Roman" w:hAnsi="Times New Roman"/>
+          <w:sz w:val="28"/>
+          <w:szCs w:val="28"/>
+        </w:rPr>
+        <w:t xml:space="preserve">, что изменения успешно применены к локальному репозиторию. </w:t>
+      </w:r>
+      <w:r>
+        <w:rPr>
+          <w:rFonts w:eastAsia="Times New Roman" w:cs="Times New Roman" w:ascii="Times New Roman" w:hAnsi="Times New Roman"/>
+          <w:sz w:val="28"/>
+          <w:szCs w:val="28"/>
+        </w:rPr>
+        <w:t>(рис 13)</w:t>
+      </w:r>
+    </w:p>
+    <w:p>
+      <w:pPr>
+        <w:pStyle w:val="Normal"/>
+        <w:spacing w:lineRule="auto" w:line="259" w:beforeAutospacing="0" w:before="0" w:afterAutospacing="0" w:after="160"/>
+        <w:ind w:left="0" w:right="0"/>
+        <w:jc w:val="left"/>
+        <w:rPr>
+          <w:rFonts w:ascii="Times New Roman" w:hAnsi="Times New Roman"/>
+          <w:sz w:val="28"/>
+          <w:szCs w:val="28"/>
+        </w:rPr>
+      </w:pPr>
+      <w:r>
+        <w:drawing>
+          <wp:anchor behindDoc="0" distT="0" distB="0" distL="0" distR="0" simplePos="0" locked="0" layoutInCell="0" allowOverlap="1" relativeHeight="14">
+            <wp:simplePos x="0" y="0"/>
+            <wp:positionH relativeFrom="column">
+              <wp:align>center</wp:align>
+            </wp:positionH>
+            <wp:positionV relativeFrom="paragraph">
+              <wp:posOffset>635</wp:posOffset>
+            </wp:positionV>
+            <wp:extent cx="5940425" cy="915035"/>
+            <wp:effectExtent l="0" t="0" r="0" b="0"/>
+            <wp:wrapSquare wrapText="largest"/>
+            <wp:docPr id="13" name="Изображение12" descr=""/>
+            <wp:cNvGraphicFramePr>
+              <a:graphicFrameLocks xmlns:a="http://schemas.openxmlformats.org/drawingml/2006/main" noChangeAspect="1"/>
+            </wp:cNvGraphicFramePr>
+            <a:graphic xmlns:a="http://schemas.openxmlformats.org/drawingml/2006/main">
+              <a:graphicData uri="http://schemas.openxmlformats.org/drawingml/2006/picture">
+                <pic:pic xmlns:pic="http://schemas.openxmlformats.org/drawingml/2006/picture">
+                  <pic:nvPicPr>
+                    <pic:cNvPr id="13" name="Изображение12" descr=""/>
+                    <pic:cNvPicPr>
+                      <a:picLocks noChangeAspect="1" noChangeArrowheads="1"/>
+                    </pic:cNvPicPr>
+                  </pic:nvPicPr>
+                  <pic:blipFill>
+                    <a:blip r:embed="rId15"/>
+                    <a:stretch>
+                      <a:fillRect/>
+                    </a:stretch>
+                  </pic:blipFill>
+                  <pic:spPr bwMode="auto">
+                    <a:xfrm>
+                      <a:off x="0" y="0"/>
+                      <a:ext cx="5940425" cy="915035"/>
+                    </a:xfrm>
+                    <a:prstGeom prst="rect">
+                      <a:avLst/>
+                    </a:prstGeom>
+                    <a:noFill/>
+                  </pic:spPr>
+                </pic:pic>
+              </a:graphicData>
+            </a:graphic>
+          </wp:anchor>
+        </w:drawing>
+      </w:r>
+      <w:r>
+        <w:rPr>
+          <w:rFonts w:eastAsia="Times New Roman" w:cs="Times New Roman" w:ascii="Times New Roman" w:hAnsi="Times New Roman"/>
+          <w:sz w:val="28"/>
+          <w:szCs w:val="28"/>
+        </w:rPr>
+        <w:t>Рис 13</w:t>
+      </w:r>
+      <w:r>
+        <w:rPr>
+          <w:rFonts w:eastAsia="Times New Roman" w:cs="Times New Roman" w:ascii="Times New Roman" w:hAnsi="Times New Roman"/>
+          <w:sz w:val="28"/>
+          <w:szCs w:val="28"/>
+        </w:rPr>
+        <w:br/>
+        <w:t>Заключениe:</w:t>
+      </w:r>
+    </w:p>
+    <w:p>
+      <w:pPr>
+        <w:pStyle w:val="Normal"/>
+        <w:spacing w:lineRule="auto" w:line="259" w:beforeAutospacing="0" w:before="0" w:afterAutospacing="0" w:after="160"/>
+        <w:ind w:left="0" w:right="0"/>
+        <w:jc w:val="left"/>
+        <w:rPr>
+          <w:rFonts w:ascii="Times New Roman" w:hAnsi="Times New Roman"/>
+          <w:sz w:val="28"/>
+          <w:szCs w:val="28"/>
+        </w:rPr>
+      </w:pPr>
+      <w:r>
         <w:rPr>
           <w:rFonts w:eastAsia="Times New Roman" w:cs="Times New Roman" w:ascii="Times New Roman" w:hAnsi="Times New Roman"/>
           <w:sz w:val="28"/>
@@ -1570,7 +2434,7 @@
         </w:rPr>
         <w:t xml:space="preserve">github с лабами - </w:t>
       </w:r>
-      <w:hyperlink r:id="rId9">
+      <w:hyperlink r:id="rId16">
         <w:r>
           <w:rPr>
             <w:rStyle w:val="Hyperlink"/>
@@ -2878,8 +3742,8 @@
       <w:color w:themeColor="accent1" w:themeShade="bf" w:val="2E74B5"/>
     </w:rPr>
   </w:style>
-  <w:style w:type="numbering" w:styleId="user2" w:default="1">
-    <w:name w:val="Без списка (user)"/>
+  <w:style w:type="numbering" w:styleId="Style10" w:default="1">
+    <w:name w:val="Без списка"/>
     <w:uiPriority w:val="99"/>
     <w:semiHidden/>
     <w:unhideWhenUsed/>

</xml_diff>